<commit_message>
Add repository link and GitHub username to Phase 1 report
Co-Authored-By: Claude Opus 5.5 <noreply@anthropic.com>
</commit_message>
<xml_diff>
--- a/docs/F26_4_Phase1_Research_and_Planning.docx
+++ b/docs/F26_4_Phase1_Research_and_Planning.docx
@@ -452,7 +452,7 @@
                 <w:sz w:val="19"/>
                 <w:szCs w:val="19"/>
               </w:rPr>
-              <w:t xml:space="preserve">[Repository link]</w:t>
+              <w:t xml:space="preserve">https://github.com/nkaplun/ai-tool-discovery-and-adoption</w:t>
             </w:r>
           </w:p>
         </w:tc>
@@ -527,7 +527,7 @@
                 <w:sz w:val="19"/>
                 <w:szCs w:val="19"/>
               </w:rPr>
-              <w:t xml:space="preserve">Nicholas Kaplun: [username]</w:t>
+              <w:t xml:space="preserve">Nicholas Kaplun: nkaplun</w:t>
             </w:r>
           </w:p>
           <w:p>
@@ -5446,7 +5446,7 @@
         <w:rPr>
           <w:rFonts w:ascii="Arial" w:cs="Arial" w:eastAsia="Arial" w:hAnsi="Arial"/>
         </w:rPr>
-        <w:t xml:space="preserve"> [Repository link]</w:t>
+        <w:t xml:space="preserve"> https://github.com/nkaplun/ai-tool-discovery-and-adoption</w:t>
       </w:r>
     </w:p>
     <w:p>

</xml_diff>